<commit_message>
fix: update institution to HUET (Khoa Ky thuat va Cong nghe - Dai hoc Hue) and major to DS&AI K3
</commit_message>
<xml_diff>
--- a/docs/DE_CUONG_CHI_TIET_KHOA_LUAN_TOT_NGHIEP.docx
+++ b/docs/DE_CUONG_CHI_TIET_KHOA_LUAN_TOT_NGHIEP.docx
@@ -16,9 +16,9 @@
         </w:rPr>
         <w:t>BỘ GIÁO DỤC VÀ ĐÀO TẠO</w:t>
         <w:br/>
-        <w:t>TRƯỜNG ĐẠI HỌC KHOA HỌC — ĐẠI HỌC HUẾ</w:t>
+        <w:t>ĐẠI HỌC HUẾ</w:t>
         <w:br/>
-        <w:t>KHOA CÔNG NGHỆ THÔNG TIN</w:t>
+        <w:t>KHOA KỸ THUẬT VÀ CÔNG NGHỆ (HUET)</w:t>
       </w:r>
     </w:p>
     <w:p>
@@ -467,7 +467,7 @@
                 <w:rFonts w:ascii="Times New Roman" w:hAnsi="Times New Roman"/>
                 <w:sz w:val="22"/>
               </w:rPr>
-              <w:t>[Họ và tên Sinh viên] | Lớp: AI Khóa 3 | MSSV: [Điền mã số SV]</w:t>
+              <w:t>[Họ và tên Sinh viên] | Ngành: Khoa học Dữ liệu &amp; Trí tuệ Nhân tạo | Khóa: K3</w:t>
             </w:r>
           </w:p>
         </w:tc>
@@ -571,7 +571,7 @@
                 <w:rFonts w:ascii="Times New Roman" w:hAnsi="Times New Roman"/>
                 <w:sz w:val="22"/>
               </w:rPr>
-              <w:t>Khoa Công nghệ Thông tin — Trường Đại học Khoa học, Đại học Huế</w:t>
+              <w:t>Khoa Kỹ thuật và Công nghệ — Đại học Huế (HUET)</w:t>
             </w:r>
           </w:p>
         </w:tc>
@@ -3197,7 +3197,7 @@
         <w:jc w:val="left"/>
       </w:pPr>
       <w:r>
-        <w:t>Báo cáo toàn văn Khóa luận tốt nghiệp: Quyển báo cáo học thuật đầy đủ 4-5 chương theo đúng quy định của Trường Đại học Khoa học — Đại học Huế.</w:t>
+        <w:t>Báo cáo toàn văn Khóa luận tốt nghiệp: Quyển báo cáo học thuật đầy đủ 4-5 chương theo đúng quy định của Khoa Kỹ thuật và Công nghệ — Đại học Huế (HUET).</w:t>
       </w:r>
     </w:p>
     <w:p>

</xml_diff>